<commit_message>
Offer to restore an expired report from the visitor's browser
On a serverless host an uploaded analysis is kept only in the memory of the
instance that handled the request, so a refresh that lands on another instance
found nothing. The dashboard now embeds its own analysis in the page and saves
a copy to the visitor's localStorage. When the server has no stored copy,
/results/<id> first tries to restore from that copy before asking the user to
start over. /report and /api/report keep their previous behaviour for the
same-instance case. Verified against a live upload: seven inline charts,
text report and JSON API all restore correctly.
</commit_message>
<xml_diff>
--- a/docs/AI_Resume_Checker_Project_Report.docx
+++ b/docs/AI_Resume_Checker_Project_Report.docx
@@ -5939,7 +5939,7 @@
         <w:jc w:val="both"/>
       </w:pPr>
       <w:r>
-        <w:t>The application comprises nine Python modules totalling approximately 5,093 lines, including 149 functions and classes.</w:t>
+        <w:t>The application comprises nine Python modules totalling approximately 5,149 lines, including 151 functions and classes.</w:t>
       </w:r>
     </w:p>
     <w:p>
@@ -6358,7 +6358,7 @@
               <w:rPr>
                 <w:sz w:val="17"/>
               </w:rPr>
-              <w:t>514</w:t>
+              <w:t>550</w:t>
             </w:r>
           </w:p>
         </w:tc>
@@ -6373,7 +6373,7 @@
               <w:rPr>
                 <w:sz w:val="17"/>
               </w:rPr>
-              <w:t>17</w:t>
+              <w:t>18</w:t>
             </w:r>
           </w:p>
         </w:tc>
@@ -6538,7 +6538,7 @@
               <w:rPr>
                 <w:sz w:val="17"/>
               </w:rPr>
-              <w:t>726</w:t>
+              <w:t>746</w:t>
             </w:r>
           </w:p>
         </w:tc>
@@ -6552,7 +6552,7 @@
               <w:rPr>
                 <w:sz w:val="17"/>
               </w:rPr>
-              <w:t>27</w:t>
+              <w:t>28</w:t>
             </w:r>
           </w:p>
         </w:tc>
@@ -14562,7 +14562,7 @@
         <w:br/>
       </w:r>
       <w:r>
-        <w:t xml:space="preserve">    result, _text, status = _recall_report(safe_id)</w:t>
+        <w:t xml:space="preserve">    result, text, status = _recall_report(safe_id)</w:t>
       </w:r>
       <w:r>
         <w:br/>
@@ -14574,53 +14574,65 @@
         <w:br/>
       </w:r>
       <w:r>
-        <w:t xml:space="preserve">        flash("That analysis could not be read. Please run it again.", "warn")</w:t>
+        <w:t xml:space="preserve">        return render_template(</w:t>
       </w:r>
       <w:r>
         <w:br/>
       </w:r>
       <w:r>
-        <w:t xml:space="preserve">        return redirect(url_for("analyze"))</w:t>
+        <w:t xml:space="preserve">            "report_expired.html", report_id=safe_id, unreadable=True,</w:t>
       </w:r>
       <w:r>
         <w:br/>
       </w:r>
       <w:r>
+        <w:t xml:space="preserve">        ), 200</w:t>
+      </w:r>
+      <w:r>
+        <w:br/>
+      </w:r>
+      <w:r>
         <w:t xml:space="preserve">    if result is None:</w:t>
       </w:r>
       <w:r>
         <w:br/>
       </w:r>
       <w:r>
-        <w:t xml:space="preserve">        flash(</w:t>
+        <w:t xml:space="preserve">        # The server may be stateless across instances, so the copy of the</w:t>
       </w:r>
       <w:r>
         <w:br/>
       </w:r>
       <w:r>
-        <w:t xml:space="preserve">            "That analysis is no longer available. Please upload your resume again.",</w:t>
+        <w:t xml:space="preserve">        # analysis the browser kept is the canonical record here. Offer it</w:t>
       </w:r>
       <w:r>
         <w:br/>
       </w:r>
       <w:r>
-        <w:t xml:space="preserve">            "warn",</w:t>
+        <w:t xml:space="preserve">        # a chance to restore before asking the user to start over.</w:t>
       </w:r>
       <w:r>
         <w:br/>
       </w:r>
       <w:r>
-        <w:t xml:space="preserve">        )</w:t>
+        <w:t xml:space="preserve">        return render_template(</w:t>
       </w:r>
       <w:r>
         <w:br/>
       </w:r>
       <w:r>
-        <w:t xml:space="preserve">        return redirect(url_for("analyze"))</w:t>
+        <w:t xml:space="preserve">            "report_expired.html", report_id=safe_id, unreadable=False,</w:t>
       </w:r>
       <w:r>
         <w:br/>
       </w:r>
+      <w:r>
+        <w:t xml:space="preserve">        ), 200</w:t>
+      </w:r>
+      <w:r>
+        <w:br/>
+      </w:r>
       <w:r/>
       <w:r>
         <w:br/>
@@ -14632,7 +14644,7 @@
         <w:br/>
       </w:r>
       <w:r>
-        <w:t xml:space="preserve">    return _render_results(result, safe_id, elapsed)</w:t>
+        <w:t xml:space="preserve">    return _render_results(result, safe_id, elapsed, text=text)</w:t>
       </w:r>
     </w:p>
     <w:p>
@@ -15097,7 +15109,7 @@
         <w:jc w:val="both"/>
       </w:pPr>
       <w:r>
-        <w:t>The suite contains 151 tests in 22 groups. The HTTP layer accounts for the largest group, because every route has both a success path and a failure path that must be verified.</w:t>
+        <w:t>The suite contains 152 tests in 22 groups. The HTTP layer accounts for the largest group, because every route has both a success path and a failure path that must be verified.</w:t>
       </w:r>
     </w:p>
     <w:p>
@@ -15426,7 +15438,7 @@
               <w:rPr>
                 <w:sz w:val="17"/>
               </w:rPr>
-              <w:t>30</w:t>
+              <w:t>31</w:t>
             </w:r>
           </w:p>
         </w:tc>
@@ -16215,7 +16227,7 @@
         <w:br/>
       </w:r>
       <w:r>
-        <w:t xml:space="preserve">  ALL TESTS PASSED - 151 test(s) ran successfully.</w:t>
+        <w:t xml:space="preserve">  ALL TESTS PASSED - 152 test(s) ran successfully.</w:t>
       </w:r>
       <w:r>
         <w:br/>
@@ -16227,19 +16239,19 @@
         <w:br/>
       </w:r>
       <w:r>
-        <w:t>.............[2026-10-05 15:06:00,901] WARNING in app: Could not read stored report 20261005_150600_c2025c: Expecting ',' delimiter: line 501 column 26 (char 11290)</w:t>
+        <w:t>.............[2026-10-05 15:27:09,297] WARNING in app: Could not read stored report 20261005_152709_3721de: Expecting ',' delimiter: line 501 column 26 (char 11290)</w:t>
       </w:r>
       <w:r>
         <w:br/>
       </w:r>
       <w:r>
-        <w:t>......................................[2026-10-05 15:06:09,837] WARNING in app: Could not build text report truncated_probe</w:t>
+        <w:t>.......................................[2026-10-05 15:27:19,534] WARNING in app: Could not build text report truncated_probe</w:t>
       </w:r>
       <w:r>
         <w:br/>
       </w:r>
       <w:r>
-        <w:t>[2026-10-05 15:06:09,838] WARNING in app: Could not read stored report truncated_probe: Expecting value: line 1 column 24 (char 23)</w:t>
+        <w:t>[2026-10-05 15:27:19,534] WARNING in app: Could not read stored report truncated_probe: Expecting value: line 1 column 24 (char 23)</w:t>
       </w:r>
       <w:r>
         <w:br/>
@@ -16257,7 +16269,7 @@
         <w:br/>
       </w:r>
       <w:r>
-        <w:t>Ran 151 tests in 13.523s</w:t>
+        <w:t>Ran 152 tests in 15.437s</w:t>
       </w:r>
       <w:r>
         <w:br/>
@@ -16275,7 +16287,7 @@
         <w:jc w:val="both"/>
       </w:pPr>
       <w:r>
-        <w:t>All 151 tests pass. The suite executes in roughly 14 seconds, which includes generating a PDF fixture and rendering charts on every pipeline test.</w:t>
+        <w:t>All 152 tests pass. The suite executes in roughly 15 seconds, which includes generating a PDF fixture and rendering charts on every pipeline test.</w:t>
       </w:r>
     </w:p>
     <w:p>
@@ -23299,7 +23311,7 @@
         <w:jc w:val="both"/>
       </w:pPr>
       <w:r>
-        <w:t>The implementation comprises approximately 5,093 lines of application logic in nine modules with no database and no JavaScript framework, and is verified by 151 automated tests. Its analytical core uses established techniques: boundary-aware regular expressions for skills, TF-IDF with cosine similarity for vocabulary overlap, and a four-component weighted rubric whose every rule is published in the application itself.</w:t>
+        <w:t>The implementation comprises approximately 5,149 lines of application logic in nine modules with no database and no JavaScript framework, and is verified by 152 automated tests. Its analytical core uses established techniques: boundary-aware regular expressions for skills, TF-IDF with cosine similarity for vocabulary overlap, and a four-component weighted rubric whose every rule is published in the application itself.</w:t>
       </w:r>
     </w:p>
     <w:p>
@@ -24945,7 +24957,7 @@
         <w:br/>
       </w:r>
       <w:r>
-        <w:t>Analysed on     : 05 Oct 2026, 03:06 PM</w:t>
+        <w:t>Analysed on     : 05 Oct 2026, 03:27 PM</w:t>
       </w:r>
       <w:r>
         <w:br/>
@@ -26249,7 +26261,7 @@
         <w:br/>
       </w:r>
       <w:r>
-        <w:t xml:space="preserve">  ALL TESTS PASSED - 151 test(s) ran successfully.</w:t>
+        <w:t xml:space="preserve">  ALL TESTS PASSED - 152 test(s) ran successfully.</w:t>
       </w:r>
       <w:r>
         <w:br/>
@@ -26261,19 +26273,19 @@
         <w:br/>
       </w:r>
       <w:r>
-        <w:t>.............[2026-10-05 15:06:00,901] WARNING in app: Could not read stored report 20261005_150600_c2025c: Expecting ',' delimiter: line 501 column 26 (char 11290)</w:t>
+        <w:t>.............[2026-10-05 15:27:09,297] WARNING in app: Could not read stored report 20261005_152709_3721de: Expecting ',' delimiter: line 501 column 26 (char 11290)</w:t>
       </w:r>
       <w:r>
         <w:br/>
       </w:r>
       <w:r>
-        <w:t>......................................[2026-10-05 15:06:09,837] WARNING in app: Could not build text report truncated_probe</w:t>
+        <w:t>.......................................[2026-10-05 15:27:19,534] WARNING in app: Could not build text report truncated_probe</w:t>
       </w:r>
       <w:r>
         <w:br/>
       </w:r>
       <w:r>
-        <w:t>[2026-10-05 15:06:09,838] WARNING in app: Could not read stored report truncated_probe: Expecting value: line 1 column 24 (char 23)</w:t>
+        <w:t>[2026-10-05 15:27:19,534] WARNING in app: Could not read stored report truncated_probe: Expecting value: line 1 column 24 (char 23)</w:t>
       </w:r>
       <w:r>
         <w:br/>
@@ -26291,7 +26303,7 @@
         <w:br/>
       </w:r>
       <w:r>
-        <w:t>Ran 151 tests in 13.523s</w:t>
+        <w:t>Ran 152 tests in 15.437s</w:t>
       </w:r>
       <w:r>
         <w:br/>

</xml_diff>